<commit_message>
Updated code and crated Hands_On_Practical_&_Steps this word file, updated steps in it and also updated README.md file in same folder.
</commit_message>
<xml_diff>
--- a/08_05_2026/Hands_On_Practical_&_Steps.docx
+++ b/08_05_2026/Hands_On_Practical_&_Steps.docx
@@ -19,13 +19,586 @@
     </w:p>
     <w:p>
       <w:pPr>
+        <w:rPr>
+          <w:b/>
+          <w:bCs/>
+        </w:rPr>
+      </w:pPr>
+    </w:p>
+    <w:p>
+      <w:pPr>
         <w:pStyle w:val="ListParagraph"/>
         <w:numPr>
           <w:ilvl w:val="0"/>
-          <w:numId w:val="1"/>
+          <w:numId w:val="3"/>
         </w:numPr>
       </w:pPr>
+      <w:r>
+        <w:t>First, I migrated from a local state to an S3 remote state.</w:t>
+      </w:r>
     </w:p>
+    <w:p/>
+    <w:p>
+      <w:r>
+        <w:drawing>
+          <wp:inline distT="0" distB="0" distL="0" distR="0" wp14:anchorId="7BF8F82F" wp14:editId="29BB614F">
+            <wp:extent cx="5731510" cy="3257550"/>
+            <wp:effectExtent l="0" t="0" r="2540" b="0"/>
+            <wp:docPr id="430061435" name="Picture 1"/>
+            <wp:cNvGraphicFramePr>
+              <a:graphicFrameLocks xmlns:a="http://schemas.openxmlformats.org/drawingml/2006/main" noChangeAspect="1"/>
+            </wp:cNvGraphicFramePr>
+            <a:graphic xmlns:a="http://schemas.openxmlformats.org/drawingml/2006/main">
+              <a:graphicData uri="http://schemas.openxmlformats.org/drawingml/2006/picture">
+                <pic:pic xmlns:pic="http://schemas.openxmlformats.org/drawingml/2006/picture">
+                  <pic:nvPicPr>
+                    <pic:cNvPr id="430061435" name=""/>
+                    <pic:cNvPicPr/>
+                  </pic:nvPicPr>
+                  <pic:blipFill>
+                    <a:blip r:embed="rId5"/>
+                    <a:stretch>
+                      <a:fillRect/>
+                    </a:stretch>
+                  </pic:blipFill>
+                  <pic:spPr>
+                    <a:xfrm>
+                      <a:off x="0" y="0"/>
+                      <a:ext cx="5731510" cy="3257550"/>
+                    </a:xfrm>
+                    <a:prstGeom prst="rect">
+                      <a:avLst/>
+                    </a:prstGeom>
+                  </pic:spPr>
+                </pic:pic>
+              </a:graphicData>
+            </a:graphic>
+          </wp:inline>
+        </w:drawing>
+      </w:r>
+    </w:p>
+    <w:p/>
+    <w:p>
+      <w:pPr>
+        <w:pStyle w:val="ListParagraph"/>
+        <w:numPr>
+          <w:ilvl w:val="0"/>
+          <w:numId w:val="3"/>
+        </w:numPr>
+      </w:pPr>
+      <w:r>
+        <w:t>Earlier, for the previous subnet creation practical, I had created only one subnet</w:t>
+      </w:r>
+      <w:r>
+        <w:t>,</w:t>
+      </w:r>
+      <w:r>
+        <w:t xml:space="preserve"> </w:t>
+      </w:r>
+      <w:r>
+        <w:t>one route table, its route entry, and the association. However, for the EKS Terraform practical, we need a minimum of two subnets. Therefore, I updated the existing Terraform code for the</w:t>
+      </w:r>
+      <w:r>
+        <w:t xml:space="preserve"> second</w:t>
+      </w:r>
+      <w:r>
+        <w:t xml:space="preserve"> subnet and added the configuration for the second subnet, its route table, route entry, and association, and then applied the changes.</w:t>
+      </w:r>
+    </w:p>
+    <w:p/>
+    <w:p>
+      <w:r>
+        <w:lastRenderedPageBreak/>
+        <w:drawing>
+          <wp:inline distT="0" distB="0" distL="0" distR="0" wp14:anchorId="35E0E86F" wp14:editId="2DE937F1">
+            <wp:extent cx="5731510" cy="3160395"/>
+            <wp:effectExtent l="0" t="0" r="2540" b="1905"/>
+            <wp:docPr id="1839214410" name="Picture 1"/>
+            <wp:cNvGraphicFramePr>
+              <a:graphicFrameLocks xmlns:a="http://schemas.openxmlformats.org/drawingml/2006/main" noChangeAspect="1"/>
+            </wp:cNvGraphicFramePr>
+            <a:graphic xmlns:a="http://schemas.openxmlformats.org/drawingml/2006/main">
+              <a:graphicData uri="http://schemas.openxmlformats.org/drawingml/2006/picture">
+                <pic:pic xmlns:pic="http://schemas.openxmlformats.org/drawingml/2006/picture">
+                  <pic:nvPicPr>
+                    <pic:cNvPr id="1839214410" name=""/>
+                    <pic:cNvPicPr/>
+                  </pic:nvPicPr>
+                  <pic:blipFill>
+                    <a:blip r:embed="rId6"/>
+                    <a:stretch>
+                      <a:fillRect/>
+                    </a:stretch>
+                  </pic:blipFill>
+                  <pic:spPr>
+                    <a:xfrm>
+                      <a:off x="0" y="0"/>
+                      <a:ext cx="5731510" cy="3160395"/>
+                    </a:xfrm>
+                    <a:prstGeom prst="rect">
+                      <a:avLst/>
+                    </a:prstGeom>
+                  </pic:spPr>
+                </pic:pic>
+              </a:graphicData>
+            </a:graphic>
+          </wp:inline>
+        </w:drawing>
+      </w:r>
+    </w:p>
+    <w:p/>
+    <w:p>
+      <w:r>
+        <w:drawing>
+          <wp:inline distT="0" distB="0" distL="0" distR="0" wp14:anchorId="55203866" wp14:editId="22113F88">
+            <wp:extent cx="5731510" cy="925195"/>
+            <wp:effectExtent l="0" t="0" r="2540" b="8255"/>
+            <wp:docPr id="1718346870" name="Picture 1"/>
+            <wp:cNvGraphicFramePr>
+              <a:graphicFrameLocks xmlns:a="http://schemas.openxmlformats.org/drawingml/2006/main" noChangeAspect="1"/>
+            </wp:cNvGraphicFramePr>
+            <a:graphic xmlns:a="http://schemas.openxmlformats.org/drawingml/2006/main">
+              <a:graphicData uri="http://schemas.openxmlformats.org/drawingml/2006/picture">
+                <pic:pic xmlns:pic="http://schemas.openxmlformats.org/drawingml/2006/picture">
+                  <pic:nvPicPr>
+                    <pic:cNvPr id="1718346870" name=""/>
+                    <pic:cNvPicPr/>
+                  </pic:nvPicPr>
+                  <pic:blipFill>
+                    <a:blip r:embed="rId7"/>
+                    <a:stretch>
+                      <a:fillRect/>
+                    </a:stretch>
+                  </pic:blipFill>
+                  <pic:spPr>
+                    <a:xfrm>
+                      <a:off x="0" y="0"/>
+                      <a:ext cx="5731510" cy="925195"/>
+                    </a:xfrm>
+                    <a:prstGeom prst="rect">
+                      <a:avLst/>
+                    </a:prstGeom>
+                  </pic:spPr>
+                </pic:pic>
+              </a:graphicData>
+            </a:graphic>
+          </wp:inline>
+        </w:drawing>
+      </w:r>
+    </w:p>
+    <w:p>
+      <w:pPr>
+        <w:pStyle w:val="ListParagraph"/>
+        <w:numPr>
+          <w:ilvl w:val="0"/>
+          <w:numId w:val="3"/>
+        </w:numPr>
+      </w:pPr>
+      <w:r>
+        <w:t>Terminated subnets and route table related resources from 06_05_2026 terraform project.</w:t>
+      </w:r>
+    </w:p>
+    <w:p>
+      <w:pPr>
+        <w:pStyle w:val="ListParagraph"/>
+        <w:numPr>
+          <w:ilvl w:val="0"/>
+          <w:numId w:val="3"/>
+        </w:numPr>
+      </w:pPr>
+      <w:r>
+        <w:t xml:space="preserve">Copy </w:t>
+      </w:r>
+      <w:r>
+        <w:t>subnets and route table related resources from 06_05_2026 terraform project</w:t>
+      </w:r>
+      <w:r>
+        <w:t xml:space="preserve"> into 08</w:t>
+      </w:r>
+      <w:r>
+        <w:t>_05_2026 terraform project</w:t>
+      </w:r>
+      <w:r>
+        <w:t xml:space="preserve"> folder into </w:t>
+      </w:r>
+      <w:r>
+        <w:t>01_Subnets_terraform-manifests</w:t>
+      </w:r>
+      <w:r>
+        <w:t xml:space="preserve"> this folder and created all those subnets, rt, routes and association from </w:t>
+      </w:r>
+      <w:r>
+        <w:t>01_Subnets_terraform-manifests</w:t>
+      </w:r>
+      <w:r>
+        <w:t xml:space="preserve"> this folder</w:t>
+      </w:r>
+      <w:r>
+        <w:t>.</w:t>
+      </w:r>
+    </w:p>
+    <w:p>
+      <w:r>
+        <w:lastRenderedPageBreak/>
+        <w:drawing>
+          <wp:inline distT="0" distB="0" distL="0" distR="0" wp14:anchorId="1138357F" wp14:editId="6D2EA2D4">
+            <wp:extent cx="5731510" cy="2834005"/>
+            <wp:effectExtent l="0" t="0" r="2540" b="4445"/>
+            <wp:docPr id="699891637" name="Picture 1"/>
+            <wp:cNvGraphicFramePr>
+              <a:graphicFrameLocks xmlns:a="http://schemas.openxmlformats.org/drawingml/2006/main" noChangeAspect="1"/>
+            </wp:cNvGraphicFramePr>
+            <a:graphic xmlns:a="http://schemas.openxmlformats.org/drawingml/2006/main">
+              <a:graphicData uri="http://schemas.openxmlformats.org/drawingml/2006/picture">
+                <pic:pic xmlns:pic="http://schemas.openxmlformats.org/drawingml/2006/picture">
+                  <pic:nvPicPr>
+                    <pic:cNvPr id="699891637" name=""/>
+                    <pic:cNvPicPr/>
+                  </pic:nvPicPr>
+                  <pic:blipFill>
+                    <a:blip r:embed="rId8"/>
+                    <a:stretch>
+                      <a:fillRect/>
+                    </a:stretch>
+                  </pic:blipFill>
+                  <pic:spPr>
+                    <a:xfrm>
+                      <a:off x="0" y="0"/>
+                      <a:ext cx="5731510" cy="2834005"/>
+                    </a:xfrm>
+                    <a:prstGeom prst="rect">
+                      <a:avLst/>
+                    </a:prstGeom>
+                  </pic:spPr>
+                </pic:pic>
+              </a:graphicData>
+            </a:graphic>
+          </wp:inline>
+        </w:drawing>
+      </w:r>
+    </w:p>
+    <w:p>
+      <w:pPr>
+        <w:pStyle w:val="ListParagraph"/>
+        <w:numPr>
+          <w:ilvl w:val="0"/>
+          <w:numId w:val="3"/>
+        </w:numPr>
+      </w:pPr>
+      <w:r>
+        <w:t xml:space="preserve">Clone the course repo’s terraform code locally and update the code as per our </w:t>
+      </w:r>
+      <w:r>
+        <w:t>Bootcamp-vpc</w:t>
+      </w:r>
+      <w:r>
+        <w:t xml:space="preserve"> </w:t>
+      </w:r>
+      <w:r>
+        <w:t>and my subnets configuration.</w:t>
+      </w:r>
+    </w:p>
+    <w:p>
+      <w:pPr>
+        <w:pStyle w:val="ListParagraph"/>
+        <w:numPr>
+          <w:ilvl w:val="0"/>
+          <w:numId w:val="3"/>
+        </w:numPr>
+      </w:pPr>
+      <w:r>
+        <w:t>Resolved the various errors occurring during terraform init and terraform plan</w:t>
+      </w:r>
+    </w:p>
+    <w:p>
+      <w:pPr>
+        <w:pStyle w:val="ListParagraph"/>
+        <w:numPr>
+          <w:ilvl w:val="0"/>
+          <w:numId w:val="3"/>
+        </w:numPr>
+      </w:pPr>
+      <w:r>
+        <w:t>During first terraform apply attempt I am getting error for iam role naming convention, so I have resolved that issue and when I run terraform apply second time it was s</w:t>
+      </w:r>
+      <w:r>
+        <w:t>uccessfully r</w:t>
+      </w:r>
+      <w:r>
+        <w:t>un</w:t>
+      </w:r>
+      <w:r>
+        <w:t xml:space="preserve"> and EKS Cluster, EKS Node group and other resources are successfully created.</w:t>
+      </w:r>
+    </w:p>
+    <w:p>
+      <w:r>
+        <w:drawing>
+          <wp:inline distT="0" distB="0" distL="0" distR="0" wp14:anchorId="3679C948" wp14:editId="5E5CCE8D">
+            <wp:extent cx="5731510" cy="1724660"/>
+            <wp:effectExtent l="0" t="0" r="2540" b="8890"/>
+            <wp:docPr id="1474773931" name="Picture 1"/>
+            <wp:cNvGraphicFramePr>
+              <a:graphicFrameLocks xmlns:a="http://schemas.openxmlformats.org/drawingml/2006/main" noChangeAspect="1"/>
+            </wp:cNvGraphicFramePr>
+            <a:graphic xmlns:a="http://schemas.openxmlformats.org/drawingml/2006/main">
+              <a:graphicData uri="http://schemas.openxmlformats.org/drawingml/2006/picture">
+                <pic:pic xmlns:pic="http://schemas.openxmlformats.org/drawingml/2006/picture">
+                  <pic:nvPicPr>
+                    <pic:cNvPr id="1474773931" name=""/>
+                    <pic:cNvPicPr/>
+                  </pic:nvPicPr>
+                  <pic:blipFill>
+                    <a:blip r:embed="rId9"/>
+                    <a:stretch>
+                      <a:fillRect/>
+                    </a:stretch>
+                  </pic:blipFill>
+                  <pic:spPr>
+                    <a:xfrm>
+                      <a:off x="0" y="0"/>
+                      <a:ext cx="5731510" cy="1724660"/>
+                    </a:xfrm>
+                    <a:prstGeom prst="rect">
+                      <a:avLst/>
+                    </a:prstGeom>
+                  </pic:spPr>
+                </pic:pic>
+              </a:graphicData>
+            </a:graphic>
+          </wp:inline>
+        </w:drawing>
+      </w:r>
+    </w:p>
+    <w:p>
+      <w:r>
+        <w:drawing>
+          <wp:inline distT="0" distB="0" distL="0" distR="0" wp14:anchorId="7C5316EA" wp14:editId="1AA3119C">
+            <wp:extent cx="4197566" cy="558829"/>
+            <wp:effectExtent l="0" t="0" r="0" b="0"/>
+            <wp:docPr id="20922165" name="Picture 1"/>
+            <wp:cNvGraphicFramePr>
+              <a:graphicFrameLocks xmlns:a="http://schemas.openxmlformats.org/drawingml/2006/main" noChangeAspect="1"/>
+            </wp:cNvGraphicFramePr>
+            <a:graphic xmlns:a="http://schemas.openxmlformats.org/drawingml/2006/main">
+              <a:graphicData uri="http://schemas.openxmlformats.org/drawingml/2006/picture">
+                <pic:pic xmlns:pic="http://schemas.openxmlformats.org/drawingml/2006/picture">
+                  <pic:nvPicPr>
+                    <pic:cNvPr id="20922165" name=""/>
+                    <pic:cNvPicPr/>
+                  </pic:nvPicPr>
+                  <pic:blipFill>
+                    <a:blip r:embed="rId10"/>
+                    <a:stretch>
+                      <a:fillRect/>
+                    </a:stretch>
+                  </pic:blipFill>
+                  <pic:spPr>
+                    <a:xfrm>
+                      <a:off x="0" y="0"/>
+                      <a:ext cx="4197566" cy="558829"/>
+                    </a:xfrm>
+                    <a:prstGeom prst="rect">
+                      <a:avLst/>
+                    </a:prstGeom>
+                  </pic:spPr>
+                </pic:pic>
+              </a:graphicData>
+            </a:graphic>
+          </wp:inline>
+        </w:drawing>
+      </w:r>
+    </w:p>
+    <w:p>
+      <w:r>
+        <w:rPr>
+          <w:b/>
+          <w:bCs/>
+        </w:rPr>
+        <w:t>Note:-</w:t>
+      </w:r>
+      <w:r>
+        <w:t xml:space="preserve"> During first terraform apply command I am getting error for iam role during that it was showing 13 resources to be added after that I have changed iam roles names and rerun terraform apply command so during second terraform apply it was showing 9 resources gets added after terraform apply.</w:t>
+      </w:r>
+    </w:p>
+    <w:p>
+      <w:r>
+        <w:lastRenderedPageBreak/>
+        <w:drawing>
+          <wp:inline distT="0" distB="0" distL="0" distR="0" wp14:anchorId="23A78868" wp14:editId="12CC6367">
+            <wp:extent cx="5731510" cy="1388110"/>
+            <wp:effectExtent l="0" t="0" r="2540" b="2540"/>
+            <wp:docPr id="1958515565" name="Picture 1"/>
+            <wp:cNvGraphicFramePr>
+              <a:graphicFrameLocks xmlns:a="http://schemas.openxmlformats.org/drawingml/2006/main" noChangeAspect="1"/>
+            </wp:cNvGraphicFramePr>
+            <a:graphic xmlns:a="http://schemas.openxmlformats.org/drawingml/2006/main">
+              <a:graphicData uri="http://schemas.openxmlformats.org/drawingml/2006/picture">
+                <pic:pic xmlns:pic="http://schemas.openxmlformats.org/drawingml/2006/picture">
+                  <pic:nvPicPr>
+                    <pic:cNvPr id="1958515565" name=""/>
+                    <pic:cNvPicPr/>
+                  </pic:nvPicPr>
+                  <pic:blipFill>
+                    <a:blip r:embed="rId11"/>
+                    <a:stretch>
+                      <a:fillRect/>
+                    </a:stretch>
+                  </pic:blipFill>
+                  <pic:spPr>
+                    <a:xfrm>
+                      <a:off x="0" y="0"/>
+                      <a:ext cx="5731510" cy="1388110"/>
+                    </a:xfrm>
+                    <a:prstGeom prst="rect">
+                      <a:avLst/>
+                    </a:prstGeom>
+                  </pic:spPr>
+                </pic:pic>
+              </a:graphicData>
+            </a:graphic>
+          </wp:inline>
+        </w:drawing>
+      </w:r>
+    </w:p>
+    <w:p/>
+    <w:p>
+      <w:r>
+        <w:drawing>
+          <wp:inline distT="0" distB="0" distL="0" distR="0" wp14:anchorId="433A3125" wp14:editId="012E96C6">
+            <wp:extent cx="5731510" cy="2839720"/>
+            <wp:effectExtent l="0" t="0" r="2540" b="0"/>
+            <wp:docPr id="1821108620" name="Picture 1"/>
+            <wp:cNvGraphicFramePr>
+              <a:graphicFrameLocks xmlns:a="http://schemas.openxmlformats.org/drawingml/2006/main" noChangeAspect="1"/>
+            </wp:cNvGraphicFramePr>
+            <a:graphic xmlns:a="http://schemas.openxmlformats.org/drawingml/2006/main">
+              <a:graphicData uri="http://schemas.openxmlformats.org/drawingml/2006/picture">
+                <pic:pic xmlns:pic="http://schemas.openxmlformats.org/drawingml/2006/picture">
+                  <pic:nvPicPr>
+                    <pic:cNvPr id="1821108620" name=""/>
+                    <pic:cNvPicPr/>
+                  </pic:nvPicPr>
+                  <pic:blipFill>
+                    <a:blip r:embed="rId12"/>
+                    <a:stretch>
+                      <a:fillRect/>
+                    </a:stretch>
+                  </pic:blipFill>
+                  <pic:spPr>
+                    <a:xfrm>
+                      <a:off x="0" y="0"/>
+                      <a:ext cx="5731510" cy="2839720"/>
+                    </a:xfrm>
+                    <a:prstGeom prst="rect">
+                      <a:avLst/>
+                    </a:prstGeom>
+                  </pic:spPr>
+                </pic:pic>
+              </a:graphicData>
+            </a:graphic>
+          </wp:inline>
+        </w:drawing>
+      </w:r>
+    </w:p>
+    <w:p>
+      <w:r>
+        <w:drawing>
+          <wp:inline distT="0" distB="0" distL="0" distR="0" wp14:anchorId="4BD5C2AB" wp14:editId="39F34888">
+            <wp:extent cx="5731510" cy="3249295"/>
+            <wp:effectExtent l="0" t="0" r="2540" b="8255"/>
+            <wp:docPr id="1441660535" name="Picture 1"/>
+            <wp:cNvGraphicFramePr>
+              <a:graphicFrameLocks xmlns:a="http://schemas.openxmlformats.org/drawingml/2006/main" noChangeAspect="1"/>
+            </wp:cNvGraphicFramePr>
+            <a:graphic xmlns:a="http://schemas.openxmlformats.org/drawingml/2006/main">
+              <a:graphicData uri="http://schemas.openxmlformats.org/drawingml/2006/picture">
+                <pic:pic xmlns:pic="http://schemas.openxmlformats.org/drawingml/2006/picture">
+                  <pic:nvPicPr>
+                    <pic:cNvPr id="1441660535" name=""/>
+                    <pic:cNvPicPr/>
+                  </pic:nvPicPr>
+                  <pic:blipFill>
+                    <a:blip r:embed="rId13"/>
+                    <a:stretch>
+                      <a:fillRect/>
+                    </a:stretch>
+                  </pic:blipFill>
+                  <pic:spPr>
+                    <a:xfrm>
+                      <a:off x="0" y="0"/>
+                      <a:ext cx="5731510" cy="3249295"/>
+                    </a:xfrm>
+                    <a:prstGeom prst="rect">
+                      <a:avLst/>
+                    </a:prstGeom>
+                  </pic:spPr>
+                </pic:pic>
+              </a:graphicData>
+            </a:graphic>
+          </wp:inline>
+        </w:drawing>
+      </w:r>
+    </w:p>
+    <w:p>
+      <w:pPr>
+        <w:pStyle w:val="ListParagraph"/>
+        <w:numPr>
+          <w:ilvl w:val="0"/>
+          <w:numId w:val="3"/>
+        </w:numPr>
+      </w:pPr>
+      <w:r>
+        <w:t>Destroy</w:t>
+      </w:r>
+      <w:r>
+        <w:t>ed</w:t>
+      </w:r>
+      <w:r>
+        <w:t xml:space="preserve"> all the resources through terraform.</w:t>
+      </w:r>
+    </w:p>
+    <w:p>
+      <w:r>
+        <w:lastRenderedPageBreak/>
+        <w:drawing>
+          <wp:inline distT="0" distB="0" distL="0" distR="0" wp14:anchorId="2D6E5982" wp14:editId="6828D9BA">
+            <wp:extent cx="5731510" cy="1188085"/>
+            <wp:effectExtent l="0" t="0" r="2540" b="0"/>
+            <wp:docPr id="2097145204" name="Picture 1"/>
+            <wp:cNvGraphicFramePr>
+              <a:graphicFrameLocks xmlns:a="http://schemas.openxmlformats.org/drawingml/2006/main" noChangeAspect="1"/>
+            </wp:cNvGraphicFramePr>
+            <a:graphic xmlns:a="http://schemas.openxmlformats.org/drawingml/2006/main">
+              <a:graphicData uri="http://schemas.openxmlformats.org/drawingml/2006/picture">
+                <pic:pic xmlns:pic="http://schemas.openxmlformats.org/drawingml/2006/picture">
+                  <pic:nvPicPr>
+                    <pic:cNvPr id="2097145204" name=""/>
+                    <pic:cNvPicPr/>
+                  </pic:nvPicPr>
+                  <pic:blipFill>
+                    <a:blip r:embed="rId14"/>
+                    <a:stretch>
+                      <a:fillRect/>
+                    </a:stretch>
+                  </pic:blipFill>
+                  <pic:spPr>
+                    <a:xfrm>
+                      <a:off x="0" y="0"/>
+                      <a:ext cx="5731510" cy="1188085"/>
+                    </a:xfrm>
+                    <a:prstGeom prst="rect">
+                      <a:avLst/>
+                    </a:prstGeom>
+                  </pic:spPr>
+                </pic:pic>
+              </a:graphicData>
+            </a:graphic>
+          </wp:inline>
+        </w:drawing>
+      </w:r>
+    </w:p>
+    <w:p/>
     <w:sectPr>
       <w:pgSz w:w="11906" w:h="16838"/>
       <w:pgMar w:top="1440" w:right="1440" w:bottom="1440" w:left="1440" w:header="708" w:footer="708" w:gutter="0"/>
@@ -127,8 +700,192 @@
       </w:pPr>
     </w:lvl>
   </w:abstractNum>
+  <w:abstractNum w:abstractNumId="1" w15:restartNumberingAfterBreak="0">
+    <w:nsid w:val="050709E1"/>
+    <w:multiLevelType w:val="hybridMultilevel"/>
+    <w:tmpl w:val="66FE8298"/>
+    <w:lvl w:ilvl="0" w:tplc="40090011">
+      <w:start w:val="1"/>
+      <w:numFmt w:val="decimal"/>
+      <w:lvlText w:val="%1)"/>
+      <w:lvlJc w:val="left"/>
+      <w:pPr>
+        <w:ind w:left="360" w:hanging="360"/>
+      </w:pPr>
+      <w:rPr>
+        <w:rFonts w:hint="default"/>
+      </w:rPr>
+    </w:lvl>
+    <w:lvl w:ilvl="1" w:tplc="40090019" w:tentative="1">
+      <w:start w:val="1"/>
+      <w:numFmt w:val="lowerLetter"/>
+      <w:lvlText w:val="%2."/>
+      <w:lvlJc w:val="left"/>
+      <w:pPr>
+        <w:ind w:left="1080" w:hanging="360"/>
+      </w:pPr>
+    </w:lvl>
+    <w:lvl w:ilvl="2" w:tplc="4009001B" w:tentative="1">
+      <w:start w:val="1"/>
+      <w:numFmt w:val="lowerRoman"/>
+      <w:lvlText w:val="%3."/>
+      <w:lvlJc w:val="right"/>
+      <w:pPr>
+        <w:ind w:left="1800" w:hanging="180"/>
+      </w:pPr>
+    </w:lvl>
+    <w:lvl w:ilvl="3" w:tplc="4009000F" w:tentative="1">
+      <w:start w:val="1"/>
+      <w:numFmt w:val="decimal"/>
+      <w:lvlText w:val="%4."/>
+      <w:lvlJc w:val="left"/>
+      <w:pPr>
+        <w:ind w:left="2520" w:hanging="360"/>
+      </w:pPr>
+    </w:lvl>
+    <w:lvl w:ilvl="4" w:tplc="40090019" w:tentative="1">
+      <w:start w:val="1"/>
+      <w:numFmt w:val="lowerLetter"/>
+      <w:lvlText w:val="%5."/>
+      <w:lvlJc w:val="left"/>
+      <w:pPr>
+        <w:ind w:left="3240" w:hanging="360"/>
+      </w:pPr>
+    </w:lvl>
+    <w:lvl w:ilvl="5" w:tplc="4009001B" w:tentative="1">
+      <w:start w:val="1"/>
+      <w:numFmt w:val="lowerRoman"/>
+      <w:lvlText w:val="%6."/>
+      <w:lvlJc w:val="right"/>
+      <w:pPr>
+        <w:ind w:left="3960" w:hanging="180"/>
+      </w:pPr>
+    </w:lvl>
+    <w:lvl w:ilvl="6" w:tplc="4009000F" w:tentative="1">
+      <w:start w:val="1"/>
+      <w:numFmt w:val="decimal"/>
+      <w:lvlText w:val="%7."/>
+      <w:lvlJc w:val="left"/>
+      <w:pPr>
+        <w:ind w:left="4680" w:hanging="360"/>
+      </w:pPr>
+    </w:lvl>
+    <w:lvl w:ilvl="7" w:tplc="40090019" w:tentative="1">
+      <w:start w:val="1"/>
+      <w:numFmt w:val="lowerLetter"/>
+      <w:lvlText w:val="%8."/>
+      <w:lvlJc w:val="left"/>
+      <w:pPr>
+        <w:ind w:left="5400" w:hanging="360"/>
+      </w:pPr>
+    </w:lvl>
+    <w:lvl w:ilvl="8" w:tplc="4009001B" w:tentative="1">
+      <w:start w:val="1"/>
+      <w:numFmt w:val="lowerRoman"/>
+      <w:lvlText w:val="%9."/>
+      <w:lvlJc w:val="right"/>
+      <w:pPr>
+        <w:ind w:left="6120" w:hanging="180"/>
+      </w:pPr>
+    </w:lvl>
+  </w:abstractNum>
+  <w:abstractNum w:abstractNumId="2" w15:restartNumberingAfterBreak="0">
+    <w:nsid w:val="3BE73EE3"/>
+    <w:multiLevelType w:val="hybridMultilevel"/>
+    <w:tmpl w:val="40544A4C"/>
+    <w:lvl w:ilvl="0" w:tplc="40090011">
+      <w:start w:val="1"/>
+      <w:numFmt w:val="decimal"/>
+      <w:lvlText w:val="%1)"/>
+      <w:lvlJc w:val="left"/>
+      <w:pPr>
+        <w:ind w:left="720" w:hanging="360"/>
+      </w:pPr>
+      <w:rPr>
+        <w:rFonts w:hint="default"/>
+      </w:rPr>
+    </w:lvl>
+    <w:lvl w:ilvl="1" w:tplc="40090019" w:tentative="1">
+      <w:start w:val="1"/>
+      <w:numFmt w:val="lowerLetter"/>
+      <w:lvlText w:val="%2."/>
+      <w:lvlJc w:val="left"/>
+      <w:pPr>
+        <w:ind w:left="1440" w:hanging="360"/>
+      </w:pPr>
+    </w:lvl>
+    <w:lvl w:ilvl="2" w:tplc="4009001B" w:tentative="1">
+      <w:start w:val="1"/>
+      <w:numFmt w:val="lowerRoman"/>
+      <w:lvlText w:val="%3."/>
+      <w:lvlJc w:val="right"/>
+      <w:pPr>
+        <w:ind w:left="2160" w:hanging="180"/>
+      </w:pPr>
+    </w:lvl>
+    <w:lvl w:ilvl="3" w:tplc="4009000F" w:tentative="1">
+      <w:start w:val="1"/>
+      <w:numFmt w:val="decimal"/>
+      <w:lvlText w:val="%4."/>
+      <w:lvlJc w:val="left"/>
+      <w:pPr>
+        <w:ind w:left="2880" w:hanging="360"/>
+      </w:pPr>
+    </w:lvl>
+    <w:lvl w:ilvl="4" w:tplc="40090019" w:tentative="1">
+      <w:start w:val="1"/>
+      <w:numFmt w:val="lowerLetter"/>
+      <w:lvlText w:val="%5."/>
+      <w:lvlJc w:val="left"/>
+      <w:pPr>
+        <w:ind w:left="3600" w:hanging="360"/>
+      </w:pPr>
+    </w:lvl>
+    <w:lvl w:ilvl="5" w:tplc="4009001B" w:tentative="1">
+      <w:start w:val="1"/>
+      <w:numFmt w:val="lowerRoman"/>
+      <w:lvlText w:val="%6."/>
+      <w:lvlJc w:val="right"/>
+      <w:pPr>
+        <w:ind w:left="4320" w:hanging="180"/>
+      </w:pPr>
+    </w:lvl>
+    <w:lvl w:ilvl="6" w:tplc="4009000F" w:tentative="1">
+      <w:start w:val="1"/>
+      <w:numFmt w:val="decimal"/>
+      <w:lvlText w:val="%7."/>
+      <w:lvlJc w:val="left"/>
+      <w:pPr>
+        <w:ind w:left="5040" w:hanging="360"/>
+      </w:pPr>
+    </w:lvl>
+    <w:lvl w:ilvl="7" w:tplc="40090019" w:tentative="1">
+      <w:start w:val="1"/>
+      <w:numFmt w:val="lowerLetter"/>
+      <w:lvlText w:val="%8."/>
+      <w:lvlJc w:val="left"/>
+      <w:pPr>
+        <w:ind w:left="5760" w:hanging="360"/>
+      </w:pPr>
+    </w:lvl>
+    <w:lvl w:ilvl="8" w:tplc="4009001B" w:tentative="1">
+      <w:start w:val="1"/>
+      <w:numFmt w:val="lowerRoman"/>
+      <w:lvlText w:val="%9."/>
+      <w:lvlJc w:val="right"/>
+      <w:pPr>
+        <w:ind w:left="6480" w:hanging="180"/>
+      </w:pPr>
+    </w:lvl>
+  </w:abstractNum>
   <w:num w:numId="1" w16cid:durableId="1375302451">
     <w:abstractNumId w:val="0"/>
+  </w:num>
+  <w:num w:numId="2" w16cid:durableId="676812119">
+    <w:abstractNumId w:val="2"/>
+  </w:num>
+  <w:num w:numId="3" w16cid:durableId="2097708953">
+    <w:abstractNumId w:val="1"/>
   </w:num>
 </w:numbering>
 </file>
@@ -736,7 +1493,6 @@
   <w:style w:type="character" w:default="1" w:styleId="DefaultParagraphFont">
     <w:name w:val="Default Paragraph Font"/>
     <w:uiPriority w:val="1"/>
-    <w:semiHidden/>
     <w:unhideWhenUsed/>
   </w:style>
   <w:style w:type="table" w:default="1" w:styleId="TableNormal">

</xml_diff>